<commit_message>
Creating Backgrounds and putting it in the game
</commit_message>
<xml_diff>
--- a/PuzzleGameDefensie/Documentatie/ShowYourselfDocumentation.docx
+++ b/PuzzleGameDefensie/Documentatie/ShowYourselfDocumentation.docx
@@ -44,8 +44,38 @@
           <w:sz w:val="56"/>
           <w:szCs w:val="56"/>
         </w:rPr>
-        <w:t>Plan van aanpak</w:t>
-      </w:r>
+        <w:t xml:space="preserve">Plan </w:t>
+      </w:r>
+      <w:r>
+        <w:rPr>
+          <w:sz w:val="56"/>
+          <w:szCs w:val="56"/>
+        </w:rPr>
+        <w:t>V</w:t>
+      </w:r>
+      <w:r>
+        <w:rPr>
+          <w:sz w:val="56"/>
+          <w:szCs w:val="56"/>
+        </w:rPr>
+        <w:t xml:space="preserve">an </w:t>
+      </w:r>
+      <w:proofErr w:type="spellStart"/>
+      <w:r>
+        <w:rPr>
+          <w:sz w:val="56"/>
+          <w:szCs w:val="56"/>
+        </w:rPr>
+        <w:t>A</w:t>
+      </w:r>
+      <w:r>
+        <w:rPr>
+          <w:sz w:val="56"/>
+          <w:szCs w:val="56"/>
+        </w:rPr>
+        <w:t>anpak</w:t>
+      </w:r>
+      <w:proofErr w:type="spellEnd"/>
     </w:p>
     <w:p>
       <w:pPr>
@@ -246,8 +276,17 @@
           <w:sz w:val="72"/>
           <w:szCs w:val="72"/>
         </w:rPr>
-        <w:t>Plan Van Aanpak</w:t>
-      </w:r>
+        <w:t xml:space="preserve">Plan Van </w:t>
+      </w:r>
+      <w:proofErr w:type="spellStart"/>
+      <w:r>
+        <w:rPr>
+          <w:sz w:val="72"/>
+          <w:szCs w:val="72"/>
+        </w:rPr>
+        <w:t>Aanpak</w:t>
+      </w:r>
+      <w:proofErr w:type="spellEnd"/>
     </w:p>
     <w:p>
       <w:pPr>
@@ -261,6 +300,7 @@
           <w:szCs w:val="52"/>
         </w:rPr>
       </w:pPr>
+      <w:proofErr w:type="spellStart"/>
       <w:r>
         <w:rPr>
           <w:sz w:val="52"/>
@@ -268,6 +308,7 @@
         </w:rPr>
         <w:t>Inleiding</w:t>
       </w:r>
+      <w:proofErr w:type="spellEnd"/>
     </w:p>
     <w:p>
       <w:pPr>
@@ -281,6 +322,7 @@
           <w:szCs w:val="52"/>
         </w:rPr>
       </w:pPr>
+      <w:proofErr w:type="spellStart"/>
       <w:r>
         <w:rPr>
           <w:sz w:val="52"/>
@@ -288,6 +330,7 @@
         </w:rPr>
         <w:t>Onderzoek</w:t>
       </w:r>
+      <w:proofErr w:type="spellEnd"/>
     </w:p>
     <w:p>
       <w:pPr>
@@ -450,29 +493,33 @@
       <w:pPr>
         <w:pStyle w:val="HeadingDaan"/>
       </w:pPr>
+      <w:proofErr w:type="spellStart"/>
       <w:r>
         <w:t>Inleiding</w:t>
       </w:r>
-    </w:p>
-    <w:p>
-      <w:pPr>
-        <w:rPr>
-          <w:sz w:val="28"/>
-          <w:szCs w:val="28"/>
-        </w:rPr>
-      </w:pPr>
-    </w:p>
-    <w:p>
-      <w:pPr>
-        <w:rPr>
-          <w:sz w:val="28"/>
-          <w:szCs w:val="28"/>
-        </w:rPr>
-      </w:pPr>
-      <w:r>
-        <w:rPr>
-          <w:sz w:val="28"/>
-          <w:szCs w:val="28"/>
+      <w:proofErr w:type="spellEnd"/>
+    </w:p>
+    <w:p>
+      <w:pPr>
+        <w:rPr>
+          <w:sz w:val="28"/>
+          <w:szCs w:val="28"/>
+        </w:rPr>
+      </w:pPr>
+    </w:p>
+    <w:p>
+      <w:pPr>
+        <w:rPr>
+          <w:sz w:val="28"/>
+          <w:szCs w:val="28"/>
+          <w:lang w:val="nl-NL"/>
+        </w:rPr>
+      </w:pPr>
+      <w:r>
+        <w:rPr>
+          <w:sz w:val="28"/>
+          <w:szCs w:val="28"/>
+          <w:lang w:val="nl-NL"/>
         </w:rPr>
         <w:t>Ik heb de opdracht gekregen om een puzzle game te maken die aansluit bij Defensie</w:t>
       </w:r>
@@ -480,6 +527,7 @@
         <w:rPr>
           <w:sz w:val="28"/>
           <w:szCs w:val="28"/>
+          <w:lang w:val="nl-NL"/>
         </w:rPr>
         <w:t>.</w:t>
       </w:r>
@@ -489,12 +537,14 @@
         <w:rPr>
           <w:sz w:val="28"/>
           <w:szCs w:val="28"/>
-        </w:rPr>
-      </w:pPr>
-      <w:r>
-        <w:rPr>
-          <w:sz w:val="28"/>
-          <w:szCs w:val="28"/>
+          <w:lang w:val="nl-NL"/>
+        </w:rPr>
+      </w:pPr>
+      <w:r>
+        <w:rPr>
+          <w:sz w:val="28"/>
+          <w:szCs w:val="28"/>
+          <w:lang w:val="nl-NL"/>
         </w:rPr>
         <w:t>Hiervoor heb ik gekozen om een 2d game te maken waarbij je als een wachter speelt op een militaire basis.</w:t>
       </w:r>
@@ -504,12 +554,14 @@
         <w:rPr>
           <w:sz w:val="28"/>
           <w:szCs w:val="28"/>
-        </w:rPr>
-      </w:pPr>
-      <w:r>
-        <w:rPr>
-          <w:sz w:val="28"/>
-          <w:szCs w:val="28"/>
+          <w:lang w:val="nl-NL"/>
+        </w:rPr>
+      </w:pPr>
+      <w:r>
+        <w:rPr>
+          <w:sz w:val="28"/>
+          <w:szCs w:val="28"/>
+          <w:lang w:val="nl-NL"/>
         </w:rPr>
         <w:t>Je moet goed kijken naar de bezoekers / militaire pas, ID bewijzen en naar het persoon of alle informatie klopt</w:t>
       </w:r>
@@ -517,6 +569,7 @@
         <w:rPr>
           <w:sz w:val="28"/>
           <w:szCs w:val="28"/>
+          <w:lang w:val="nl-NL"/>
         </w:rPr>
         <w:t>, maar hierbij heb je een boekje om alles af te kunnen lezen wat wel toegestaan is, en welke documenten niet binnen mogen komen</w:t>
       </w:r>
@@ -524,6 +577,7 @@
         <w:rPr>
           <w:sz w:val="28"/>
           <w:szCs w:val="28"/>
+          <w:lang w:val="nl-NL"/>
         </w:rPr>
         <w:t>.</w:t>
       </w:r>
@@ -533,12 +587,14 @@
         <w:rPr>
           <w:sz w:val="28"/>
           <w:szCs w:val="28"/>
-        </w:rPr>
-      </w:pPr>
-      <w:r>
-        <w:rPr>
-          <w:sz w:val="28"/>
-          <w:szCs w:val="28"/>
+          <w:lang w:val="nl-NL"/>
+        </w:rPr>
+      </w:pPr>
+      <w:r>
+        <w:rPr>
+          <w:sz w:val="28"/>
+          <w:szCs w:val="28"/>
+          <w:lang w:val="nl-NL"/>
         </w:rPr>
         <w:t>Iedere ochtend komt er een nieuwsbrief binnen over waar je extra op moet letten, welke wijzigingen er zijn, of helemaal niks.</w:t>
       </w:r>
@@ -548,12 +604,14 @@
         <w:rPr>
           <w:sz w:val="28"/>
           <w:szCs w:val="28"/>
-        </w:rPr>
-      </w:pPr>
-      <w:r>
-        <w:rPr>
-          <w:sz w:val="28"/>
-          <w:szCs w:val="28"/>
+          <w:lang w:val="nl-NL"/>
+        </w:rPr>
+      </w:pPr>
+      <w:r>
+        <w:rPr>
+          <w:sz w:val="28"/>
+          <w:szCs w:val="28"/>
+          <w:lang w:val="nl-NL"/>
         </w:rPr>
         <w:t>Eenmaal als alles klopt, kun je degene door laten gaan, maar eenmaal als dat niet zo is,</w:t>
       </w:r>
@@ -561,6 +619,7 @@
         <w:rPr>
           <w:sz w:val="28"/>
           <w:szCs w:val="28"/>
+          <w:lang w:val="nl-NL"/>
         </w:rPr>
         <w:t xml:space="preserve"> moet je diegene wegsturen en is hij dus niet welkom.</w:t>
       </w:r>
@@ -570,12 +629,14 @@
         <w:rPr>
           <w:sz w:val="28"/>
           <w:szCs w:val="28"/>
-        </w:rPr>
-      </w:pPr>
-      <w:r>
-        <w:rPr>
-          <w:sz w:val="28"/>
-          <w:szCs w:val="28"/>
+          <w:lang w:val="nl-NL"/>
+        </w:rPr>
+      </w:pPr>
+      <w:r>
+        <w:rPr>
+          <w:sz w:val="28"/>
+          <w:szCs w:val="28"/>
+          <w:lang w:val="nl-NL"/>
         </w:rPr>
         <w:t>Het doel is zo min mogelijk mensen die niet op de basis mogen zijn wegsturen, en de veiligheid voorop te houden.</w:t>
       </w:r>
@@ -583,6 +644,7 @@
         <w:rPr>
           <w:sz w:val="28"/>
           <w:szCs w:val="28"/>
+          <w:lang w:val="nl-NL"/>
         </w:rPr>
         <w:t xml:space="preserve"> </w:t>
       </w:r>
@@ -592,62 +654,70 @@
         <w:rPr>
           <w:sz w:val="28"/>
           <w:szCs w:val="28"/>
-        </w:rPr>
-      </w:pPr>
-    </w:p>
-    <w:p>
-      <w:pPr>
-        <w:rPr>
-          <w:sz w:val="28"/>
-          <w:szCs w:val="28"/>
-        </w:rPr>
-      </w:pPr>
-    </w:p>
-    <w:p>
-      <w:pPr>
-        <w:rPr>
-          <w:sz w:val="28"/>
-          <w:szCs w:val="28"/>
-        </w:rPr>
-      </w:pPr>
-    </w:p>
-    <w:p>
-      <w:pPr>
-        <w:rPr>
-          <w:sz w:val="28"/>
-          <w:szCs w:val="28"/>
-        </w:rPr>
-      </w:pPr>
-    </w:p>
-    <w:p>
-      <w:pPr>
-        <w:rPr>
-          <w:sz w:val="28"/>
-          <w:szCs w:val="28"/>
-        </w:rPr>
-      </w:pPr>
-    </w:p>
-    <w:p>
-      <w:pPr>
-        <w:rPr>
-          <w:sz w:val="28"/>
-          <w:szCs w:val="28"/>
-        </w:rPr>
-      </w:pPr>
-    </w:p>
-    <w:p>
-      <w:pPr>
-        <w:rPr>
-          <w:sz w:val="28"/>
-          <w:szCs w:val="28"/>
-        </w:rPr>
-      </w:pPr>
-    </w:p>
-    <w:p>
-      <w:pPr>
-        <w:rPr>
-          <w:sz w:val="28"/>
-          <w:szCs w:val="28"/>
+          <w:lang w:val="nl-NL"/>
+        </w:rPr>
+      </w:pPr>
+    </w:p>
+    <w:p>
+      <w:pPr>
+        <w:rPr>
+          <w:sz w:val="28"/>
+          <w:szCs w:val="28"/>
+          <w:lang w:val="nl-NL"/>
+        </w:rPr>
+      </w:pPr>
+    </w:p>
+    <w:p>
+      <w:pPr>
+        <w:rPr>
+          <w:sz w:val="28"/>
+          <w:szCs w:val="28"/>
+          <w:lang w:val="nl-NL"/>
+        </w:rPr>
+      </w:pPr>
+    </w:p>
+    <w:p>
+      <w:pPr>
+        <w:rPr>
+          <w:sz w:val="28"/>
+          <w:szCs w:val="28"/>
+          <w:lang w:val="nl-NL"/>
+        </w:rPr>
+      </w:pPr>
+    </w:p>
+    <w:p>
+      <w:pPr>
+        <w:rPr>
+          <w:sz w:val="28"/>
+          <w:szCs w:val="28"/>
+          <w:lang w:val="nl-NL"/>
+        </w:rPr>
+      </w:pPr>
+    </w:p>
+    <w:p>
+      <w:pPr>
+        <w:rPr>
+          <w:sz w:val="28"/>
+          <w:szCs w:val="28"/>
+          <w:lang w:val="nl-NL"/>
+        </w:rPr>
+      </w:pPr>
+    </w:p>
+    <w:p>
+      <w:pPr>
+        <w:rPr>
+          <w:sz w:val="28"/>
+          <w:szCs w:val="28"/>
+          <w:lang w:val="nl-NL"/>
+        </w:rPr>
+      </w:pPr>
+    </w:p>
+    <w:p>
+      <w:pPr>
+        <w:rPr>
+          <w:sz w:val="28"/>
+          <w:szCs w:val="28"/>
+          <w:lang w:val="nl-NL"/>
         </w:rPr>
       </w:pPr>
     </w:p>
@@ -657,130 +727,329 @@
         <w:rPr>
           <w:sz w:val="44"/>
           <w:szCs w:val="44"/>
+          <w:lang w:val="nl-NL"/>
         </w:rPr>
       </w:pPr>
       <w:r>
         <w:rPr>
           <w:sz w:val="44"/>
           <w:szCs w:val="44"/>
+          <w:lang w:val="nl-NL"/>
         </w:rPr>
         <w:lastRenderedPageBreak/>
         <w:t>Onderzoek</w:t>
       </w:r>
     </w:p>
-    <w:p/>
-    <w:p>
-      <w:r>
+    <w:p>
+      <w:pPr>
+        <w:rPr>
+          <w:lang w:val="nl-NL"/>
+        </w:rPr>
+      </w:pPr>
+    </w:p>
+    <w:p>
+      <w:pPr>
+        <w:rPr>
+          <w:lang w:val="nl-NL"/>
+        </w:rPr>
+      </w:pPr>
+      <w:r>
+        <w:rPr>
+          <w:lang w:val="nl-NL"/>
+        </w:rPr>
         <w:t>Ik heb veel onderzoek gedaan over de punten die ik nodig heb om een game te maken aangezien je niet alles kan gebruiken om een game te maken.</w:t>
       </w:r>
     </w:p>
     <w:p>
-      <w:r>
+      <w:pPr>
+        <w:rPr>
+          <w:lang w:val="nl-NL"/>
+        </w:rPr>
+      </w:pPr>
+      <w:r>
+        <w:rPr>
+          <w:lang w:val="nl-NL"/>
+        </w:rPr>
         <w:t xml:space="preserve">Hierbij komen </w:t>
       </w:r>
       <w:r>
+        <w:rPr>
+          <w:lang w:val="nl-NL"/>
+        </w:rPr>
         <w:t>veel regels kijken, waaronder copyright.</w:t>
       </w:r>
     </w:p>
     <w:p>
-      <w:r>
+      <w:pPr>
+        <w:rPr>
+          <w:lang w:val="nl-NL"/>
+        </w:rPr>
+      </w:pPr>
+      <w:r>
+        <w:rPr>
+          <w:lang w:val="nl-NL"/>
+        </w:rPr>
         <w:t xml:space="preserve">Maar ook omdat het Thema Defensie is </w:t>
       </w:r>
       <w:r>
+        <w:rPr>
+          <w:lang w:val="nl-NL"/>
+        </w:rPr>
         <w:t>mag ik absoluut niet alles gebruiken aangezien daar natuurlijk ook regels aan vastgebonden zit.</w:t>
       </w:r>
     </w:p>
     <w:p>
-      <w:r>
+      <w:pPr>
+        <w:rPr>
+          <w:lang w:val="nl-NL"/>
+        </w:rPr>
+      </w:pPr>
+      <w:r>
+        <w:rPr>
+          <w:lang w:val="nl-NL"/>
+        </w:rPr>
         <w:t xml:space="preserve">Hierbij mijn onderzoeksvragen </w:t>
       </w:r>
       <w:r>
+        <w:rPr>
+          <w:lang w:val="nl-NL"/>
+        </w:rPr>
         <w:t>die ik heb gebruikt om te kijken of ik alles kan gebruiken wat ik wil gebruiken.</w:t>
       </w:r>
     </w:p>
-    <w:p/>
-    <w:p>
-      <w:r>
+    <w:p>
+      <w:pPr>
+        <w:rPr>
+          <w:lang w:val="nl-NL"/>
+        </w:rPr>
+      </w:pPr>
+    </w:p>
+    <w:p>
+      <w:pPr>
+        <w:rPr>
+          <w:lang w:val="nl-NL"/>
+        </w:rPr>
+      </w:pPr>
+      <w:r>
+        <w:rPr>
+          <w:lang w:val="nl-NL"/>
+        </w:rPr>
         <w:t xml:space="preserve">“Zit er </w:t>
       </w:r>
       <w:r>
+        <w:rPr>
+          <w:lang w:val="nl-NL"/>
+        </w:rPr>
         <w:t>Copyright op Papers, please?”</w:t>
       </w:r>
     </w:p>
     <w:p>
-      <w:r>
+      <w:pPr>
+        <w:rPr>
+          <w:lang w:val="nl-NL"/>
+        </w:rPr>
+      </w:pPr>
+      <w:r>
+        <w:rPr>
+          <w:lang w:val="nl-NL"/>
+        </w:rPr>
         <w:t>Deze vraag heb ik gesteld aangezien het lijkt op Papers, please.</w:t>
       </w:r>
     </w:p>
     <w:p>
-      <w:r>
+      <w:pPr>
+        <w:rPr>
+          <w:lang w:val="nl-NL"/>
+        </w:rPr>
+      </w:pPr>
+      <w:r>
+        <w:rPr>
+          <w:lang w:val="nl-NL"/>
+        </w:rPr>
         <w:t>Ook games die op een Andere games zou lijken moet je zeker opletten dat het niet hetzelfde gaat zijn.</w:t>
       </w:r>
     </w:p>
     <w:p>
-      <w:r>
+      <w:pPr>
+        <w:rPr>
+          <w:lang w:val="nl-NL"/>
+        </w:rPr>
+      </w:pPr>
+      <w:r>
+        <w:rPr>
+          <w:lang w:val="nl-NL"/>
+        </w:rPr>
         <w:t xml:space="preserve">Papers, please </w:t>
       </w:r>
       <w:r>
-        <w:t>heeft alleen een copyright op hun eigen muziek, maar op de game niet, alleen op de artstyle die hun gebruiken.</w:t>
-      </w:r>
-    </w:p>
-    <w:p>
-      <w:r>
+        <w:rPr>
+          <w:lang w:val="nl-NL"/>
+        </w:rPr>
+        <w:t xml:space="preserve">heeft alleen een copyright op hun eigen muziek, maar op de game niet, alleen op de artstyle die </w:t>
+      </w:r>
+      <w:r>
+        <w:rPr>
+          <w:lang w:val="nl-NL"/>
+        </w:rPr>
+        <w:t>zij</w:t>
+      </w:r>
+      <w:r>
+        <w:rPr>
+          <w:lang w:val="nl-NL"/>
+        </w:rPr>
+        <w:t xml:space="preserve"> gebruiken.</w:t>
+      </w:r>
+    </w:p>
+    <w:p>
+      <w:pPr>
+        <w:rPr>
+          <w:lang w:val="nl-NL"/>
+        </w:rPr>
+      </w:pPr>
+      <w:r>
+        <w:rPr>
+          <w:lang w:val="nl-NL"/>
+        </w:rPr>
         <w:t>Ik ga mijn eigen assets maken, dus qua Copyright kom ik niet in aanmerking.</w:t>
       </w:r>
     </w:p>
-    <w:p/>
-    <w:p/>
-    <w:p/>
-    <w:p/>
-    <w:p>
-      <w:r>
+    <w:p>
+      <w:pPr>
+        <w:rPr>
+          <w:lang w:val="nl-NL"/>
+        </w:rPr>
+      </w:pPr>
+    </w:p>
+    <w:p>
+      <w:pPr>
+        <w:rPr>
+          <w:lang w:val="nl-NL"/>
+        </w:rPr>
+      </w:pPr>
+    </w:p>
+    <w:p>
+      <w:pPr>
+        <w:rPr>
+          <w:lang w:val="nl-NL"/>
+        </w:rPr>
+      </w:pPr>
+    </w:p>
+    <w:p>
+      <w:pPr>
+        <w:rPr>
+          <w:lang w:val="nl-NL"/>
+        </w:rPr>
+      </w:pPr>
+    </w:p>
+    <w:p>
+      <w:pPr>
+        <w:rPr>
+          <w:lang w:val="nl-NL"/>
+        </w:rPr>
+      </w:pPr>
+      <w:r>
+        <w:rPr>
+          <w:lang w:val="nl-NL"/>
+        </w:rPr>
         <w:t xml:space="preserve">“Mag </w:t>
       </w:r>
       <w:r>
+        <w:rPr>
+          <w:lang w:val="nl-NL"/>
+        </w:rPr>
         <w:t>ik zomaar een game maken over Defensie?”</w:t>
       </w:r>
     </w:p>
     <w:p>
-      <w:r>
+      <w:pPr>
+        <w:rPr>
+          <w:lang w:val="nl-NL"/>
+        </w:rPr>
+      </w:pPr>
+      <w:r>
+        <w:rPr>
+          <w:lang w:val="nl-NL"/>
+        </w:rPr>
         <w:t xml:space="preserve">Nee, dat mag </w:t>
       </w:r>
       <w:r>
+        <w:rPr>
+          <w:lang w:val="nl-NL"/>
+        </w:rPr>
         <w:t>niet zomaar</w:t>
       </w:r>
       <w:r>
+        <w:rPr>
+          <w:lang w:val="nl-NL"/>
+        </w:rPr>
         <w:t>.</w:t>
       </w:r>
     </w:p>
     <w:p>
-      <w:r>
+      <w:pPr>
+        <w:rPr>
+          <w:lang w:val="nl-NL"/>
+        </w:rPr>
+      </w:pPr>
+      <w:r>
+        <w:rPr>
+          <w:lang w:val="nl-NL"/>
+        </w:rPr>
         <w:t xml:space="preserve">Maar omdat het </w:t>
       </w:r>
       <w:r>
+        <w:rPr>
+          <w:lang w:val="nl-NL"/>
+        </w:rPr>
         <w:t xml:space="preserve">niet </w:t>
       </w:r>
       <w:r>
+        <w:rPr>
+          <w:lang w:val="nl-NL"/>
+        </w:rPr>
         <w:t>publiekelijk gedeeld word</w:t>
       </w:r>
       <w:r>
+        <w:rPr>
+          <w:lang w:val="nl-NL"/>
+        </w:rPr>
         <w:t>, en dus voor educatieve doeleindes word gebruikt met een opdracht mag het wel</w:t>
       </w:r>
       <w:r>
+        <w:rPr>
+          <w:lang w:val="nl-NL"/>
+        </w:rPr>
         <w:t>, in overleg met het delen voor onder andere school</w:t>
       </w:r>
       <w:r>
+        <w:rPr>
+          <w:lang w:val="nl-NL"/>
+        </w:rPr>
         <w:t>.</w:t>
       </w:r>
     </w:p>
     <w:p>
-      <w:r>
+      <w:pPr>
+        <w:rPr>
+          <w:lang w:val="nl-NL"/>
+        </w:rPr>
+      </w:pPr>
+      <w:r>
+        <w:rPr>
+          <w:lang w:val="nl-NL"/>
+        </w:rPr>
         <w:t>Er zijn wel strenge regels met het laten zien of delen van Defensie games</w:t>
       </w:r>
       <w:r>
+        <w:rPr>
+          <w:lang w:val="nl-NL"/>
+        </w:rPr>
         <w:t>, dus zomaar maken mag natuurlijk niet</w:t>
       </w:r>
       <w:r>
+        <w:rPr>
+          <w:lang w:val="nl-NL"/>
+        </w:rPr>
         <w:t xml:space="preserve">. </w:t>
       </w:r>
     </w:p>
@@ -789,24 +1058,45 @@
         <w:rPr>
           <w:sz w:val="28"/>
           <w:szCs w:val="28"/>
+          <w:lang w:val="nl-NL"/>
         </w:rPr>
       </w:pPr>
     </w:p>
     <w:p>
       <w:pPr>
         <w:pStyle w:val="HeadingDaan"/>
-      </w:pPr>
-      <w:r>
+        <w:rPr>
+          <w:lang w:val="nl-NL"/>
+        </w:rPr>
+      </w:pPr>
+      <w:r>
+        <w:rPr>
+          <w:lang w:val="nl-NL"/>
+        </w:rPr>
         <w:lastRenderedPageBreak/>
         <w:t>Planning</w:t>
       </w:r>
     </w:p>
     <w:p>
-      <w:r>
+      <w:pPr>
+        <w:rPr>
+          <w:lang w:val="nl-NL"/>
+        </w:rPr>
+      </w:pPr>
+      <w:r>
+        <w:rPr>
+          <w:lang w:val="nl-NL"/>
+        </w:rPr>
         <w:t>Hierbij heb ik een planning gemaakt voor dit project tot aan de deadline.</w:t>
       </w:r>
     </w:p>
-    <w:p/>
+    <w:p>
+      <w:pPr>
+        <w:rPr>
+          <w:lang w:val="nl-NL"/>
+        </w:rPr>
+      </w:pPr>
+    </w:p>
     <w:tbl>
       <w:tblPr>
         <w:tblStyle w:val="TableGrid"/>
@@ -1019,22 +1309,67 @@
               <w:rPr>
                 <w:sz w:val="28"/>
                 <w:szCs w:val="28"/>
-                <w:lang w:val="nl-NL"/>
               </w:rPr>
             </w:pPr>
             <w:r>
               <w:rPr>
                 <w:sz w:val="28"/>
                 <w:szCs w:val="28"/>
-                <w:lang w:val="nl-NL"/>
-              </w:rPr>
-              <w:t>Begin Stage, Brainstormen en uittypen idee Show Yourself</w:t>
+              </w:rPr>
+              <w:t xml:space="preserve">Begin Stage, </w:t>
+            </w:r>
+            <w:proofErr w:type="spellStart"/>
+            <w:r>
+              <w:rPr>
+                <w:sz w:val="28"/>
+                <w:szCs w:val="28"/>
+              </w:rPr>
+              <w:t>Brainstormen</w:t>
+            </w:r>
+            <w:proofErr w:type="spellEnd"/>
+            <w:r>
+              <w:rPr>
+                <w:sz w:val="28"/>
+                <w:szCs w:val="28"/>
+              </w:rPr>
+              <w:t xml:space="preserve"> </w:t>
+            </w:r>
+            <w:proofErr w:type="spellStart"/>
+            <w:r>
+              <w:rPr>
+                <w:sz w:val="28"/>
+                <w:szCs w:val="28"/>
+              </w:rPr>
+              <w:t>en</w:t>
+            </w:r>
+            <w:proofErr w:type="spellEnd"/>
+            <w:r>
+              <w:rPr>
+                <w:sz w:val="28"/>
+                <w:szCs w:val="28"/>
+              </w:rPr>
+              <w:t xml:space="preserve"> </w:t>
+            </w:r>
+            <w:proofErr w:type="spellStart"/>
+            <w:r>
+              <w:rPr>
+                <w:sz w:val="28"/>
+                <w:szCs w:val="28"/>
+              </w:rPr>
+              <w:t>uittypen</w:t>
+            </w:r>
+            <w:proofErr w:type="spellEnd"/>
+            <w:r>
+              <w:rPr>
+                <w:sz w:val="28"/>
+                <w:szCs w:val="28"/>
+              </w:rPr>
+              <w:t xml:space="preserve"> idee Show Yourself</w:t>
             </w:r>
             <w:r>
               <w:rPr>
                 <w:sz w:val="28"/>
                 <w:szCs w:val="28"/>
-                <w:lang w:val="nl-NL"/>
               </w:rPr>
               <w:t>.</w:t>
             </w:r>
@@ -1884,26 +2219,18 @@
         <w:rPr>
           <w:sz w:val="44"/>
           <w:szCs w:val="44"/>
-          <w:lang w:val="nl-NL"/>
         </w:rPr>
       </w:pPr>
       <w:r>
         <w:rPr>
           <w:sz w:val="44"/>
           <w:szCs w:val="44"/>
-          <w:lang w:val="nl-NL"/>
         </w:rPr>
         <w:lastRenderedPageBreak/>
         <w:t>Game Design Document (Functional Design Document)</w:t>
       </w:r>
     </w:p>
-    <w:p>
-      <w:pPr>
-        <w:rPr>
-          <w:lang w:val="nl-NL"/>
-        </w:rPr>
-      </w:pPr>
-    </w:p>
+    <w:p/>
     <w:p>
       <w:pPr>
         <w:rPr>
@@ -2481,21 +2808,10 @@
             <w:tcW w:w="3117" w:type="dxa"/>
           </w:tcPr>
           <w:p>
-            <w:pPr>
-              <w:rPr>
-                <w:lang w:val="nl-NL"/>
-              </w:rPr>
-            </w:pPr>
             <w:r>
-              <w:rPr>
-                <w:lang w:val="nl-NL"/>
-              </w:rPr>
               <w:t>Unity, C#</w:t>
             </w:r>
             <w:r>
-              <w:rPr>
-                <w:lang w:val="nl-NL"/>
-              </w:rPr>
               <w:t>, Visual studio Code</w:t>
             </w:r>
           </w:p>

</xml_diff>